<commit_message>
updated survival analysis latency to feed uncertainty propogation for F-after. Bootstrap method now changed to capture trial level clustering. Downstream graphs and main model inputs updated (F_after_boot), updated.
</commit_message>
<xml_diff>
--- a/3_BT_FB4_model/Graphs/revisions Sept 2026/NetEnergyCosts_summary.docx
+++ b/3_BT_FB4_model/Graphs/revisions Sept 2026/NetEnergyCosts_summary.docx
@@ -676,7 +676,7 @@
                 <w:szCs w:val="22"/>
                 <w:color w:val="000000"/>
               </w:rPr>
-              <w:t xml:space="preserve">-14950.3 (-20540.2 – -9624.5)</w:t>
+              <w:t xml:space="preserve">-14704.6 (-20140.7 – -9934.9)</w:t>
             </w:r>
           </w:p>
         </w:tc>
@@ -898,7 +898,7 @@
                 <w:szCs w:val="22"/>
                 <w:color w:val="000000"/>
               </w:rPr>
-              <w:t xml:space="preserve">-44850.9 (-61620.5 – -28873.4)</w:t>
+              <w:t xml:space="preserve">-44113.8 (-60422.1 – -29804.8)</w:t>
             </w:r>
           </w:p>
         </w:tc>
@@ -1120,7 +1120,7 @@
                 <w:szCs w:val="22"/>
                 <w:color w:val="000000"/>
               </w:rPr>
-              <w:t xml:space="preserve">-74751.4 (-102700.8 – -48122.3)</w:t>
+              <w:t xml:space="preserve">-73522.9 (-100703.5 – -49674.6)</w:t>
             </w:r>
           </w:p>
         </w:tc>
@@ -1564,7 +1564,7 @@
                 <w:szCs w:val="22"/>
                 <w:color w:val="000000"/>
               </w:rPr>
-              <w:t xml:space="preserve">-7748.7 (-10003.9 – -6276.0)</w:t>
+              <w:t xml:space="preserve">-7785.1 (-9792.5 – -6344.4)</w:t>
             </w:r>
           </w:p>
         </w:tc>
@@ -1786,7 +1786,7 @@
                 <w:szCs w:val="22"/>
                 <w:color w:val="000000"/>
               </w:rPr>
-              <w:t xml:space="preserve">-23246.0 (-30011.7 – -18828.0)</w:t>
+              <w:t xml:space="preserve">-23355.3 (-29377.6 – -19033.2)</w:t>
             </w:r>
           </w:p>
         </w:tc>
@@ -2008,7 +2008,7 @@
                 <w:szCs w:val="22"/>
                 <w:color w:val="000000"/>
               </w:rPr>
-              <w:t xml:space="preserve">-38743.4 (-50019.6 – -31380.0)</w:t>
+              <w:t xml:space="preserve">-38925.6 (-48962.7 – -31722.0)</w:t>
             </w:r>
           </w:p>
         </w:tc>
@@ -2452,7 +2452,7 @@
                 <w:szCs w:val="22"/>
                 <w:color w:val="000000"/>
               </w:rPr>
-              <w:t xml:space="preserve">-10553.5 (-16118.8 – -5235.4)</w:t>
+              <w:t xml:space="preserve">-10322.8 (-15724.2 – -5527.5)</w:t>
             </w:r>
           </w:p>
         </w:tc>
@@ -2674,7 +2674,7 @@
                 <w:szCs w:val="22"/>
                 <w:color w:val="000000"/>
               </w:rPr>
-              <w:t xml:space="preserve">-31660.5 (-48356.4 – -15706.3)</w:t>
+              <w:t xml:space="preserve">-30968.5 (-47172.5 – -16582.5)</w:t>
             </w:r>
           </w:p>
         </w:tc>
@@ -2896,7 +2896,7 @@
                 <w:szCs w:val="22"/>
                 <w:color w:val="000000"/>
               </w:rPr>
-              <w:t xml:space="preserve">-52767.5 (-80594.0 – -26177.2)</w:t>
+              <w:t xml:space="preserve">-51614.1 (-78620.8 – -27637.6)</w:t>
             </w:r>
           </w:p>
         </w:tc>
@@ -3340,7 +3340,7 @@
                 <w:szCs w:val="22"/>
                 <w:color w:val="000000"/>
               </w:rPr>
-              <w:t xml:space="preserve">-3354.2 (-5600.3 – -1913.5)</w:t>
+              <w:t xml:space="preserve">-3381.9 (-5363.9 – -1981.5)</w:t>
             </w:r>
           </w:p>
         </w:tc>
@@ -3562,7 +3562,7 @@
                 <w:szCs w:val="22"/>
                 <w:color w:val="000000"/>
               </w:rPr>
-              <w:t xml:space="preserve">-10062.7 (-16801.0 – -5740.4)</w:t>
+              <w:t xml:space="preserve">-10145.7 (-16091.6 – -5944.4)</w:t>
             </w:r>
           </w:p>
         </w:tc>
@@ -3784,7 +3784,7 @@
                 <w:szCs w:val="22"/>
                 <w:color w:val="000000"/>
               </w:rPr>
-              <w:t xml:space="preserve">-16771.2 (-28001.6 – -9567.3)</w:t>
+              <w:t xml:space="preserve">-16909.5 (-26819.4 – -9907.3)</w:t>
             </w:r>
           </w:p>
         </w:tc>
@@ -4228,7 +4228,7 @@
                 <w:szCs w:val="22"/>
                 <w:color w:val="000000"/>
               </w:rPr>
-              <w:t xml:space="preserve">-12404.8 (-17989.7 – -7098.8)</w:t>
+              <w:t xml:space="preserve">-12178.7 (-17593.0 – -7392.5)</w:t>
             </w:r>
           </w:p>
         </w:tc>
@@ -4450,7 +4450,7 @@
                 <w:szCs w:val="22"/>
                 <w:color w:val="000000"/>
               </w:rPr>
-              <w:t xml:space="preserve">-37214.5 (-53969.2 – -21296.3)</w:t>
+              <w:t xml:space="preserve">-36536.0 (-52779.0 – -22177.6)</w:t>
             </w:r>
           </w:p>
         </w:tc>
@@ -4672,7 +4672,7 @@
                 <w:szCs w:val="22"/>
                 <w:color w:val="000000"/>
               </w:rPr>
-              <w:t xml:space="preserve">-62024.2 (-89948.6 – -35493.9)</w:t>
+              <w:t xml:space="preserve">-60893.3 (-87965.0 – -36962.7)</w:t>
             </w:r>
           </w:p>
         </w:tc>
@@ -5116,7 +5116,7 @@
                 <w:szCs w:val="22"/>
                 <w:color w:val="000000"/>
               </w:rPr>
-              <w:t xml:space="preserve">-5214.3 (-7466.0 – -3767.4)</w:t>
+              <w:t xml:space="preserve">-5245.6 (-7237.9 – -3827.5)</w:t>
             </w:r>
           </w:p>
         </w:tc>
@@ -5338,7 +5338,7 @@
                 <w:szCs w:val="22"/>
                 <w:color w:val="000000"/>
               </w:rPr>
-              <w:t xml:space="preserve">-15642.9 (-22397.9 – -11302.1)</w:t>
+              <w:t xml:space="preserve">-15736.7 (-21713.8 – -11482.5)</w:t>
             </w:r>
           </w:p>
         </w:tc>
@@ -5560,7 +5560,7 @@
                 <w:szCs w:val="22"/>
                 <w:color w:val="000000"/>
               </w:rPr>
-              <w:t xml:space="preserve">-26071.4 (-37329.8 – -18836.8)</w:t>
+              <w:t xml:space="preserve">-26227.8 (-36189.6 – -19137.4)</w:t>
             </w:r>
           </w:p>
         </w:tc>

</xml_diff>